<commit_message>
Restyle portfolio and refresh CV, share card, and 404
- New dark technical look: column grid, uppercase headlines, Geist Mono
  labels, electric blue accent, crop-mark portrait, hairline project grid
- Replace vague claims with one measured spec: DB Games Grid 2.7.1 ships
  as 141 KB minified / 46 KB gzipped, runtime and styles included
- Remove repeated copy across hero, cards, experience and about; drop the
  Warera Automator experiment
- Rewrite the CV in the site's plain voice; render it from HTML with
  Playwright and fix the stale Nosotros demo link
- Regenerate the share image from an HTML template (og-card.jpg)
- Prerender a real 404.html with noindex
- Remove Tailwind, unused logos, CV variants and the stale sitemap
</commit_message>
<xml_diff>
--- a/output/docx/javier-vallejo-cv-harvard.docx
+++ b/output/docx/javier-vallejo-cv-harvard.docx
@@ -35,7 +35,7 @@
           <w:sz w:val="20"/>
           <w:u w:val="none"/>
         </w:rPr>
-        <w:t>FULL-STACK SOFTWARE ENGINEER</w:t>
+        <w:t>FULL-STACK DEVELOPER</w:t>
       </w:r>
     </w:p>
     <w:p>
@@ -168,7 +168,7 @@
           <w:sz w:val="19"/>
           <w:u w:val="none"/>
         </w:rPr>
-        <w:t>Performance-minded full-stack engineer who turns complex platform constraints into fast, app-like products. I combine architecture, optimization, cross-device craft, and strong design judgment, with primary ownership of DB Games Grid and its flagship portal experience.</w:t>
+        <w:t>Full-stack developer at DigitalBeat in Gibraltar. I own DB Games Grid, the Svelte 5 casino catalogue used across several brands, and built the Hard Rock Bet Mexico portal around it. Outside work I build real-time and self-hosted web apps.</w:t>
       </w:r>
     </w:p>
     <w:p>
@@ -281,7 +281,7 @@
           <w:sz w:val="19"/>
           <w:u w:val="none"/>
         </w:rPr>
-        <w:t>Took primary ownership of DB Games Grid around its 1.4-era codebase and led its 2.x evolution into a reusable Svelte 5 platform for game discovery and live casino experiences.</w:t>
+        <w:t>Own DB Games Grid, a Svelte 5 web component for game search, favorites, jackpots, and live tables. Took it over at version 1.4 and have led it through the 2.x releases (currently 2.7.1).</w:t>
       </w:r>
     </w:p>
     <w:p>
@@ -303,7 +303,7 @@
           <w:sz w:val="19"/>
           <w:u w:val="none"/>
         </w:rPr>
-        <w:t>Built the flagship Hard Rock Bet Mexico portal across casino, live casino, sportsbook, and promotions, including custom mobile navigation, pre-paint state, staged content bootstrapping, route orchestration, and authentication-aware UI.</w:t>
+        <w:t>Built the Hard Rock Bet Mexico portal shell across casino, live casino, sportsbook, and promotions: route handling, custom mobile navigation, and authentication-aware content.</w:t>
       </w:r>
     </w:p>
     <w:p>
@@ -325,7 +325,7 @@
           <w:sz w:val="19"/>
           <w:u w:val="none"/>
         </w:rPr>
-        <w:t>Made performance a product constraint: kept shipped code lean, eliminated repeated work, shared timers and caches, scheduled visual updates efficiently, and optimized rendering for lower-end devices.</w:t>
+        <w:t>Kept the whole component, including the Svelte runtime and styles, to one 46 KB gzipped script; shared timers and caches, scheduled visual updates by frame, and limited rendering to visible content for lower-end phones.</w:t>
       </w:r>
     </w:p>
     <w:p>
@@ -347,29 +347,7 @@
           <w:sz w:val="19"/>
           <w:u w:val="none"/>
         </w:rPr>
-        <w:t>Expanded the platform with live data, search and facets, personalization, jackpots, provider navigation, deep routes, analytics, and accessible interaction.</w:t>
-      </w:r>
-    </w:p>
-    <w:p>
-      <w:pPr>
-        <w:numPr>
-          <w:ilvl w:val="0"/>
-          <w:numId w:val="10"/>
-        </w:numPr>
-        <w:keepLines/>
-        <w:widowControl/>
-        <w:spacing w:before="0" w:after="20" w:line="245" w:lineRule="auto"/>
-      </w:pPr>
-      <w:r>
-        <w:rPr>
-          <w:rFonts w:ascii="Times New Roman" w:hAnsi="Times New Roman" w:eastAsia="Times New Roman"/>
-          <w:b w:val="0"/>
-          <w:i w:val="0"/>
-          <w:color w:val="000000"/>
-          <w:sz w:val="19"/>
-          <w:u w:val="none"/>
-        </w:rPr>
-        <w:t>Partnered across product, design, engineering, and delivery to refine modern responsive patterns and carry the shared foundation into additional brands.</w:t>
+        <w:t>Adapted the component for NorthStar, 888, RoyalsCasino, Galera.bet, and Brasilbet with each brand's product and design teams.</w:t>
       </w:r>
     </w:p>
     <w:p>
@@ -426,7 +404,7 @@
           <w:sz w:val="19"/>
           <w:u w:val="none"/>
         </w:rPr>
-        <w:t>Developed responsive HTML, CSS, and JavaScript campaigns and brand experiences within Playtech CMS.</w:t>
+        <w:t>Built responsive HTML, CSS, and JavaScript campaign pages and brand content in Playtech CMS.</w:t>
       </w:r>
     </w:p>
     <w:p>
@@ -448,7 +426,7 @@
           <w:sz w:val="19"/>
           <w:u w:val="none"/>
         </w:rPr>
-        <w:t>Improved production reliability through troubleshooting, performance checks, cross-browser QA, content versioning, and release coordination.</w:t>
+        <w:t>Handled cross-browser QA, production troubleshooting, content versioning, and releases.</w:t>
       </w:r>
     </w:p>
     <w:p>
@@ -526,7 +504,7 @@
           <w:sz w:val="19"/>
           <w:u w:val="none"/>
         </w:rPr>
-        <w:t>Turned the hotel's physical Wall of Fame into an interactive, touchscreen-compatible web experience and adapted it across visitor displays.</w:t>
+        <w:t>Turned the hotel's physical Wall of Fame into a touchscreen web experience with HTML, CSS, JavaScript, and AroSuite, adapted to several display sizes.</w:t>
       </w:r>
     </w:p>
     <w:p>
@@ -547,7 +525,7 @@
           <w:sz w:val="20"/>
           <w:u w:val="none"/>
         </w:rPr>
-        <w:t>Informatica CR, Spain (Remote)</w:t>
+        <w:t>Informática CR, Spain (Remote)</w:t>
       </w:r>
       <w:r>
         <w:tab/>
@@ -604,7 +582,7 @@
           <w:sz w:val="19"/>
           <w:u w:val="none"/>
         </w:rPr>
-        <w:t>Built a WordPress ticket and receipt workflow with customer accounts, print requests, PDF generation, history, and document retrieval.</w:t>
+        <w:t>Built a WordPress ticket and receipt system for a printing business, with customer accounts, print requests, PDF generation, and document history.</w:t>
       </w:r>
     </w:p>
     <w:p>
@@ -771,7 +749,7 @@
           <w:sz w:val="19"/>
           <w:u w:val="none"/>
         </w:rPr>
-        <w:t>Built a server-authoritative social deduction game for 3-12 players with private rooms, role-safe messaging, reconnectable sessions, timers, and voting.</w:t>
+        <w:t>Social deduction game for 3-12 players. One Durable Object per room owns the game state, secret roles go only to the right player, and players can rejoin after a dropped connection.</w:t>
       </w:r>
     </w:p>
     <w:p>
@@ -844,7 +822,7 @@
           <w:sz w:val="19"/>
           <w:u w:val="none"/>
         </w:rPr>
-        <w:t>Built a private iOS-first PWA with shared calendars, photos, lists, mood tracking, memories, games, and a self-hosted data layer.</w:t>
+        <w:t>Installable app for two people with shared calendars, photos, and lists. Next.js frontend and Hono API, with PostgreSQL on a self-hosted server behind a Cloudflare tunnel.</w:t>
       </w:r>
     </w:p>
     <w:p>
@@ -882,7 +860,7 @@
           <w:sz w:val="18"/>
           <w:u w:val="none"/>
         </w:rPr>
-        <w:t xml:space="preserve">Frontend platform: </w:t>
+        <w:t xml:space="preserve">Languages and frameworks: </w:t>
       </w:r>
       <w:r>
         <w:rPr>
@@ -893,63 +871,7 @@
           <w:sz w:val="18"/>
           <w:u w:val="none"/>
         </w:rPr>
-        <w:t>TypeScript, JavaScript, Svelte 5, React, Next.js, Web Components, HTML, CSS</w:t>
-      </w:r>
-    </w:p>
-    <w:p>
-      <w:pPr>
-        <w:widowControl/>
-        <w:spacing w:before="0" w:after="10" w:line="240" w:lineRule="auto"/>
-      </w:pPr>
-      <w:r>
-        <w:rPr>
-          <w:rFonts w:ascii="Times New Roman" w:hAnsi="Times New Roman" w:eastAsia="Times New Roman"/>
-          <w:b/>
-          <w:i w:val="0"/>
-          <w:color w:val="000000"/>
-          <w:sz w:val="18"/>
-          <w:u w:val="none"/>
-        </w:rPr>
-        <w:t xml:space="preserve">Performance engineering: </w:t>
-      </w:r>
-      <w:r>
-        <w:rPr>
-          <w:rFonts w:ascii="Times New Roman" w:hAnsi="Times New Roman" w:eastAsia="Times New Roman"/>
-          <w:b w:val="0"/>
-          <w:i w:val="0"/>
-          <w:color w:val="000000"/>
-          <w:sz w:val="18"/>
-          <w:u w:val="none"/>
-        </w:rPr>
-        <w:t>bundle and render optimization, lazy and conditional rendering, caching and indexing, frame-scheduled updates, low-end-device optimization</w:t>
-      </w:r>
-    </w:p>
-    <w:p>
-      <w:pPr>
-        <w:widowControl/>
-        <w:spacing w:before="0" w:after="10" w:line="240" w:lineRule="auto"/>
-      </w:pPr>
-      <w:r>
-        <w:rPr>
-          <w:rFonts w:ascii="Times New Roman" w:hAnsi="Times New Roman" w:eastAsia="Times New Roman"/>
-          <w:b/>
-          <w:i w:val="0"/>
-          <w:color w:val="000000"/>
-          <w:sz w:val="18"/>
-          <w:u w:val="none"/>
-        </w:rPr>
-        <w:t xml:space="preserve">Product systems: </w:t>
-      </w:r>
-      <w:r>
-        <w:rPr>
-          <w:rFonts w:ascii="Times New Roman" w:hAnsi="Times New Roman" w:eastAsia="Times New Roman"/>
-          <w:b w:val="0"/>
-          <w:i w:val="0"/>
-          <w:color w:val="000000"/>
-          <w:sz w:val="18"/>
-          <w:u w:val="none"/>
-        </w:rPr>
-        <w:t>WebSockets, search and facets, personalization, routing, authentication-aware UI, analytics, accessibility</w:t>
+        <w:t>TypeScript, JavaScript, Svelte 5, React, Next.js, Web Components, HTML, CSS, Python</w:t>
       </w:r>
     </w:p>
     <w:p>
@@ -977,7 +899,7 @@
           <w:sz w:val="18"/>
           <w:u w:val="none"/>
         </w:rPr>
-        <w:t>Node.js, Hono, FastAPI, Python, SQL, PostgreSQL, Supabase</w:t>
+        <w:t>Node.js, Hono, FastAPI, PostgreSQL, Drizzle, Supabase</w:t>
       </w:r>
     </w:p>
     <w:p>
@@ -994,7 +916,7 @@
           <w:sz w:val="18"/>
           <w:u w:val="none"/>
         </w:rPr>
-        <w:t xml:space="preserve">Delivery and quality: </w:t>
+        <w:t xml:space="preserve">Infrastructure and tooling: </w:t>
       </w:r>
       <w:r>
         <w:rPr>
@@ -1005,7 +927,7 @@
           <w:sz w:val="18"/>
           <w:u w:val="none"/>
         </w:rPr>
-        <w:t>Cloudflare Workers, Durable Objects, AWS, Docker, Vercel, Git, Vite, Playwright, Vitest</w:t>
+        <w:t>Cloudflare Workers, Durable Objects, Vercel, Docker, AWS, Git, Vite, Playwright, Vitest</w:t>
       </w:r>
     </w:p>
     <w:p>

</xml_diff>